<commit_message>
Add real terminal screenshots to Lab 27
Nine captures from a live run on 2026-09-27 (kind, Kubernetes 1.37.0, Flux
2.9.5, Gitea 1.22 in-cluster), replacing the 'screenshots outstanding' note.

The run reproduced every documented result, including the stop at 8/25
replicas. Two captures are better than the text promised: the quota view shows
limits.cpu exhausted at 4/4 while requests.cpu had used only 800m of 2, which
is precisely why it stopped at 8 rather than the predicted 20.

Step 6's quoted revision is updated from cca67164 to 769a9c39 so the text
matches the images. The 2026-09-25 transcript keeps its own revisions and the
Evidence section explains the difference.

Co-Authored-By: Claude Opus 5 <noreply@anthropic.com>
</commit_message>
<xml_diff>
--- a/day-3-gitops-fleet-and-governance/lab-27-tenant-quota-governance.docx
+++ b/day-3-gitops-fleet-and-governance/lab-27-tenant-quota-governance.docx
@@ -2,14 +2,6 @@
 <file path=word/document.xml><?xml version="1.0" encoding="utf-8"?>
 <w:document xmlns:w="http://schemas.openxmlformats.org/wordprocessingml/2006/main" xmlns:m="http://schemas.openxmlformats.org/officeDocument/2006/math" xmlns:r="http://schemas.openxmlformats.org/officeDocument/2006/relationships" xmlns:o="urn:schemas-microsoft-com:office:office" xmlns:v="urn:schemas-microsoft-com:vml" xmlns:w10="urn:schemas-microsoft-com:office:word" xmlns:a="http://schemas.openxmlformats.org/drawingml/2006/main" xmlns:pic="http://schemas.openxmlformats.org/drawingml/2006/picture" xmlns:wp="http://schemas.openxmlformats.org/drawingml/2006/wordprocessingDrawing">
   <w:body>
-    <w:p>
-      <w:pPr>
-        <w:pStyle w:val="Title"/>
-      </w:pPr>
-      <w:r>
-        <w:t xml:space="preserve">Lab 27 — Make a Tenant Budget Real (ResourceQuota, LimitRange &amp; a Fleet Budget)</w:t>
-      </w:r>
-    </w:p>
     <w:p>
       <w:pPr>
         <w:pStyle w:val="Author"/>
@@ -735,7 +727,7 @@
       </w:r>
     </w:p>
     <w:bookmarkEnd w:id="15"/>
-    <w:bookmarkStart w:id="16" w:name="X331c58de73c428e70d7df539161b5d69223c07e"/>
+    <w:bookmarkStart w:id="19" w:name="X331c58de73c428e70d7df539161b5d69223c07e"/>
     <w:p>
       <w:pPr>
         <w:pStyle w:val="Heading2"/>
@@ -1422,6 +1414,53 @@
       </w:r>
       <w:r>
         <w:t xml:space="preserve">, reachable from inside the cluster and from nowhere else.</w:t>
+      </w:r>
+    </w:p>
+    <w:p>
+      <w:pPr>
+        <w:pStyle w:val="BodyText"/>
+      </w:pPr>
+      <w:r>
+        <w:drawing>
+          <wp:inline>
+            <wp:extent cx="5943600" cy="694320"/>
+            <wp:effectExtent b="0" l="0" r="0" t="0"/>
+            <wp:docPr descr="Flux sourcing from Gitea inside the cluster: revision main@sha1:24cc9bd9, Ready True, and a URL that resolves nowhere but this cluster" title="" id="17" name="Picture"/>
+            <a:graphic>
+              <a:graphicData uri="http://schemas.openxmlformats.org/drawingml/2006/picture">
+                <pic:pic>
+                  <pic:nvPicPr>
+                    <pic:cNvPr descr="../artifacts/lab-27/screenshots/01-flux-from-in-cluster-git.png" id="18" name="Picture"/>
+                    <pic:cNvPicPr>
+                      <a:picLocks noChangeArrowheads="1" noChangeAspect="1"/>
+                    </pic:cNvPicPr>
+                  </pic:nvPicPr>
+                  <pic:blipFill>
+                    <a:blip r:embed="rId16"/>
+                    <a:stretch>
+                      <a:fillRect/>
+                    </a:stretch>
+                  </pic:blipFill>
+                  <pic:spPr bwMode="auto">
+                    <a:xfrm>
+                      <a:off x="0" y="0"/>
+                      <a:ext cx="5943600" cy="694320"/>
+                    </a:xfrm>
+                    <a:prstGeom prst="rect">
+                      <a:avLst/>
+                    </a:prstGeom>
+                    <a:noFill/>
+                    <a:ln w="9525">
+                      <a:noFill/>
+                      <a:headEnd/>
+                      <a:tailEnd/>
+                    </a:ln>
+                  </pic:spPr>
+                </pic:pic>
+              </a:graphicData>
+            </a:graphic>
+          </wp:inline>
+        </w:drawing>
       </w:r>
     </w:p>
     <w:p>
@@ -1431,8 +1470,8 @@
         </w:pict>
       </w:r>
     </w:p>
-    <w:bookmarkEnd w:id="16"/>
-    <w:bookmarkStart w:id="17" w:name="Xc3914a55eb26cbfdfa752d525d6596c9e0bcb2d"/>
+    <w:bookmarkEnd w:id="19"/>
+    <w:bookmarkStart w:id="23" w:name="Xc3914a55eb26cbfdfa752d525d6596c9e0bcb2d"/>
     <w:p>
       <w:pPr>
         <w:pStyle w:val="Heading2"/>
@@ -2412,6 +2451,53 @@
       </w:r>
       <w:r>
         <w:t xml:space="preserve">rather than a suggestion.</w:t>
+      </w:r>
+    </w:p>
+    <w:p>
+      <w:pPr>
+        <w:pStyle w:val="BodyText"/>
+      </w:pPr>
+      <w:r>
+        <w:drawing>
+          <wp:inline>
+            <wp:extent cx="5943600" cy="856418"/>
+            <wp:effectExtent b="0" l="0" r="0" t="0"/>
+            <wp:docPr descr="The team-a namespace carries Flux's ownership labels, and its ResourceQuota holds the values committed to Git" title="" id="21" name="Picture"/>
+            <a:graphic>
+              <a:graphicData uri="http://schemas.openxmlformats.org/drawingml/2006/picture">
+                <pic:pic>
+                  <pic:nvPicPr>
+                    <pic:cNvPr descr="../artifacts/lab-27/screenshots/02-tenant-delivered-by-flux.png" id="22" name="Picture"/>
+                    <pic:cNvPicPr>
+                      <a:picLocks noChangeArrowheads="1" noChangeAspect="1"/>
+                    </pic:cNvPicPr>
+                  </pic:nvPicPr>
+                  <pic:blipFill>
+                    <a:blip r:embed="rId20"/>
+                    <a:stretch>
+                      <a:fillRect/>
+                    </a:stretch>
+                  </pic:blipFill>
+                  <pic:spPr bwMode="auto">
+                    <a:xfrm>
+                      <a:off x="0" y="0"/>
+                      <a:ext cx="5943600" cy="856418"/>
+                    </a:xfrm>
+                    <a:prstGeom prst="rect">
+                      <a:avLst/>
+                    </a:prstGeom>
+                    <a:noFill/>
+                    <a:ln w="9525">
+                      <a:noFill/>
+                      <a:headEnd/>
+                      <a:tailEnd/>
+                    </a:ln>
+                  </pic:spPr>
+                </pic:pic>
+              </a:graphicData>
+            </a:graphic>
+          </wp:inline>
+        </w:drawing>
       </w:r>
     </w:p>
     <w:p>
@@ -2421,8 +2507,8 @@
         </w:pict>
       </w:r>
     </w:p>
-    <w:bookmarkEnd w:id="17"/>
-    <w:bookmarkStart w:id="18" w:name="X93e0d5f7c4f233d677fdbc89318ff297a363af1"/>
+    <w:bookmarkEnd w:id="23"/>
+    <w:bookmarkStart w:id="30" w:name="X93e0d5f7c4f233d677fdbc89318ff297a363af1"/>
     <w:p>
       <w:pPr>
         <w:pStyle w:val="Heading2"/>
@@ -2693,6 +2779,53 @@
         <w:pStyle w:val="BodyText"/>
       </w:pPr>
       <w:r>
+        <w:drawing>
+          <wp:inline>
+            <wp:extent cx="5943600" cy="694320"/>
+            <wp:effectExtent b="0" l="0" r="0" t="0"/>
+            <wp:docPr descr="No resources found in team-a, while the Deployment reports 0/1 — there is no Pod to diagnose" title="" id="25" name="Picture"/>
+            <a:graphic>
+              <a:graphicData uri="http://schemas.openxmlformats.org/drawingml/2006/picture">
+                <pic:pic>
+                  <pic:nvPicPr>
+                    <pic:cNvPr descr="../artifacts/lab-27/screenshots/03-deployment-vanishes.png" id="26" name="Picture"/>
+                    <pic:cNvPicPr>
+                      <a:picLocks noChangeArrowheads="1" noChangeAspect="1"/>
+                    </pic:cNvPicPr>
+                  </pic:nvPicPr>
+                  <pic:blipFill>
+                    <a:blip r:embed="rId24"/>
+                    <a:stretch>
+                      <a:fillRect/>
+                    </a:stretch>
+                  </pic:blipFill>
+                  <pic:spPr bwMode="auto">
+                    <a:xfrm>
+                      <a:off x="0" y="0"/>
+                      <a:ext cx="5943600" cy="694320"/>
+                    </a:xfrm>
+                    <a:prstGeom prst="rect">
+                      <a:avLst/>
+                    </a:prstGeom>
+                    <a:noFill/>
+                    <a:ln w="9525">
+                      <a:noFill/>
+                      <a:headEnd/>
+                      <a:tailEnd/>
+                    </a:ln>
+                  </pic:spPr>
+                </pic:pic>
+              </a:graphicData>
+            </a:graphic>
+          </wp:inline>
+        </w:drawing>
+      </w:r>
+    </w:p>
+    <w:p>
+      <w:pPr>
+        <w:pStyle w:val="BodyText"/>
+      </w:pPr>
+      <w:r>
         <w:t xml:space="preserve">The error is two objects away, on the ReplicaSet:</w:t>
       </w:r>
     </w:p>
@@ -2848,6 +2981,53 @@
       </w:r>
       <w:r>
         <w:t xml:space="preserve">— and a stock Deployment states none. The tenant is not over budget. It cannot spend at all.</w:t>
+      </w:r>
+    </w:p>
+    <w:p>
+      <w:pPr>
+        <w:pStyle w:val="BodyText"/>
+      </w:pPr>
+      <w:r>
+        <w:drawing>
+          <wp:inline>
+            <wp:extent cx="5943600" cy="613271"/>
+            <wp:effectExtent b="0" l="0" r="0" t="0"/>
+            <wp:docPr descr="The real error, two objects away on the ReplicaSet: must specify limits.cpu, limits.memory, requests.cpu and requests.memory" title="" id="28" name="Picture"/>
+            <a:graphic>
+              <a:graphicData uri="http://schemas.openxmlformats.org/drawingml/2006/picture">
+                <pic:pic>
+                  <pic:nvPicPr>
+                    <pic:cNvPr descr="../artifacts/lab-27/screenshots/04-error-is-on-the-replicaset.png" id="29" name="Picture"/>
+                    <pic:cNvPicPr>
+                      <a:picLocks noChangeArrowheads="1" noChangeAspect="1"/>
+                    </pic:cNvPicPr>
+                  </pic:nvPicPr>
+                  <pic:blipFill>
+                    <a:blip r:embed="rId27"/>
+                    <a:stretch>
+                      <a:fillRect/>
+                    </a:stretch>
+                  </pic:blipFill>
+                  <pic:spPr bwMode="auto">
+                    <a:xfrm>
+                      <a:off x="0" y="0"/>
+                      <a:ext cx="5943600" cy="613271"/>
+                    </a:xfrm>
+                    <a:prstGeom prst="rect">
+                      <a:avLst/>
+                    </a:prstGeom>
+                    <a:noFill/>
+                    <a:ln w="9525">
+                      <a:noFill/>
+                      <a:headEnd/>
+                      <a:tailEnd/>
+                    </a:ln>
+                  </pic:spPr>
+                </pic:pic>
+              </a:graphicData>
+            </a:graphic>
+          </wp:inline>
+        </w:drawing>
       </w:r>
     </w:p>
     <w:p>
@@ -2902,8 +3082,8 @@
         </w:pict>
       </w:r>
     </w:p>
-    <w:bookmarkEnd w:id="18"/>
-    <w:bookmarkStart w:id="19" w:name="step-4--ship-the-limitrange-the-same-way"/>
+    <w:bookmarkEnd w:id="30"/>
+    <w:bookmarkStart w:id="34" w:name="step-4--ship-the-limitrange-the-same-way"/>
     <w:p>
       <w:pPr>
         <w:pStyle w:val="Heading2"/>
@@ -3678,6 +3858,53 @@
       </w:r>
       <w:r>
         <w:t xml:space="preserve">Ship them together or the tenant is simply locked out.</w:t>
+      </w:r>
+    </w:p>
+    <w:p>
+      <w:pPr>
+        <w:pStyle w:val="BodyText"/>
+      </w:pPr>
+      <w:r>
+        <w:drawing>
+          <wp:inline>
+            <wp:extent cx="5943600" cy="775369"/>
+            <wp:effectExtent b="0" l="0" r="0" t="0"/>
+            <wp:docPr descr="The same untouched Deployment is now Running, its container carrying the LimitRange's defaults: limits 500m/512Mi, requests 100m/128Mi" title="" id="32" name="Picture"/>
+            <a:graphic>
+              <a:graphicData uri="http://schemas.openxmlformats.org/drawingml/2006/picture">
+                <pic:pic>
+                  <pic:nvPicPr>
+                    <pic:cNvPr descr="../artifacts/lab-27/screenshots/05-limitrange-supplies-the-defaults.png" id="33" name="Picture"/>
+                    <pic:cNvPicPr>
+                      <a:picLocks noChangeArrowheads="1" noChangeAspect="1"/>
+                    </pic:cNvPicPr>
+                  </pic:nvPicPr>
+                  <pic:blipFill>
+                    <a:blip r:embed="rId31"/>
+                    <a:stretch>
+                      <a:fillRect/>
+                    </a:stretch>
+                  </pic:blipFill>
+                  <pic:spPr bwMode="auto">
+                    <a:xfrm>
+                      <a:off x="0" y="0"/>
+                      <a:ext cx="5943600" cy="775369"/>
+                    </a:xfrm>
+                    <a:prstGeom prst="rect">
+                      <a:avLst/>
+                    </a:prstGeom>
+                    <a:noFill/>
+                    <a:ln w="9525">
+                      <a:noFill/>
+                      <a:headEnd/>
+                      <a:tailEnd/>
+                    </a:ln>
+                  </pic:spPr>
+                </pic:pic>
+              </a:graphicData>
+            </a:graphic>
+          </wp:inline>
+        </w:drawing>
       </w:r>
     </w:p>
     <w:p>
@@ -3687,8 +3914,8 @@
         </w:pict>
       </w:r>
     </w:p>
-    <w:bookmarkEnd w:id="19"/>
-    <w:bookmarkStart w:id="20" w:name="X522dd29d37ffb669325f2df8ccd9c72def0111f"/>
+    <w:bookmarkEnd w:id="34"/>
+    <w:bookmarkStart w:id="41" w:name="X522dd29d37ffb669325f2df8ccd9c72def0111f"/>
     <w:p>
       <w:pPr>
         <w:pStyle w:val="Heading2"/>
@@ -4002,6 +4229,53 @@
       </w:r>
       <w:r>
         <w:t xml:space="preserve">.</w:t>
+      </w:r>
+    </w:p>
+    <w:p>
+      <w:pPr>
+        <w:pStyle w:val="BodyText"/>
+      </w:pPr>
+      <w:r>
+        <w:drawing>
+          <wp:inline>
+            <wp:extent cx="5943600" cy="856418"/>
+            <wp:effectExtent b="0" l="0" r="0" t="0"/>
+            <wp:docPr descr="Scaled to 25, stopped at 8/25 — and the quota shows why: limits.cpu is exhausted at 4/4 while requests.cpu has used only 800m of 2" title="" id="36" name="Picture"/>
+            <a:graphic>
+              <a:graphicData uri="http://schemas.openxmlformats.org/drawingml/2006/picture">
+                <pic:pic>
+                  <pic:nvPicPr>
+                    <pic:cNvPr descr="../artifacts/lab-27/screenshots/06-quota-exhaustion.png" id="37" name="Picture"/>
+                    <pic:cNvPicPr>
+                      <a:picLocks noChangeArrowheads="1" noChangeAspect="1"/>
+                    </pic:cNvPicPr>
+                  </pic:nvPicPr>
+                  <pic:blipFill>
+                    <a:blip r:embed="rId35"/>
+                    <a:stretch>
+                      <a:fillRect/>
+                    </a:stretch>
+                  </pic:blipFill>
+                  <pic:spPr bwMode="auto">
+                    <a:xfrm>
+                      <a:off x="0" y="0"/>
+                      <a:ext cx="5943600" cy="856418"/>
+                    </a:xfrm>
+                    <a:prstGeom prst="rect">
+                      <a:avLst/>
+                    </a:prstGeom>
+                    <a:noFill/>
+                    <a:ln w="9525">
+                      <a:noFill/>
+                      <a:headEnd/>
+                      <a:tailEnd/>
+                    </a:ln>
+                  </pic:spPr>
+                </pic:pic>
+              </a:graphicData>
+            </a:graphic>
+          </wp:inline>
+        </w:drawing>
       </w:r>
     </w:p>
     <w:p>
@@ -4156,6 +4430,53 @@
     </w:p>
     <w:p>
       <w:pPr>
+        <w:pStyle w:val="BodyText"/>
+      </w:pPr>
+      <w:r>
+        <w:drawing>
+          <wp:inline>
+            <wp:extent cx="5943600" cy="613271"/>
+            <wp:effectExtent b="0" l="0" r="0" t="0"/>
+            <wp:docPr descr="The refusal names the binding constraint: requested limits.cpu=500m against used limits.cpu=4 of a limit of 4" title="" id="39" name="Picture"/>
+            <a:graphic>
+              <a:graphicData uri="http://schemas.openxmlformats.org/drawingml/2006/picture">
+                <pic:pic>
+                  <pic:nvPicPr>
+                    <pic:cNvPr descr="../artifacts/lab-27/screenshots/07-why-it-stopped-at-8.png" id="40" name="Picture"/>
+                    <pic:cNvPicPr>
+                      <a:picLocks noChangeArrowheads="1" noChangeAspect="1"/>
+                    </pic:cNvPicPr>
+                  </pic:nvPicPr>
+                  <pic:blipFill>
+                    <a:blip r:embed="rId38"/>
+                    <a:stretch>
+                      <a:fillRect/>
+                    </a:stretch>
+                  </pic:blipFill>
+                  <pic:spPr bwMode="auto">
+                    <a:xfrm>
+                      <a:off x="0" y="0"/>
+                      <a:ext cx="5943600" cy="613271"/>
+                    </a:xfrm>
+                    <a:prstGeom prst="rect">
+                      <a:avLst/>
+                    </a:prstGeom>
+                    <a:noFill/>
+                    <a:ln w="9525">
+                      <a:noFill/>
+                      <a:headEnd/>
+                      <a:tailEnd/>
+                    </a:ln>
+                  </pic:spPr>
+                </pic:pic>
+              </a:graphicData>
+            </a:graphic>
+          </wp:inline>
+        </w:drawing>
+      </w:r>
+    </w:p>
+    <w:p>
+      <w:pPr>
         <w:pStyle w:val="BlockText"/>
       </w:pPr>
       <w:r>
@@ -4210,8 +4531,8 @@
         </w:pict>
       </w:r>
     </w:p>
-    <w:bookmarkEnd w:id="20"/>
-    <w:bookmarkStart w:id="21" w:name="X5e61f86131d480fec571b26ba34f7b164aca1ca"/>
+    <w:bookmarkEnd w:id="41"/>
+    <w:bookmarkStart w:id="48" w:name="X5e61f86131d480fec571b26ba34f7b164aca1ca"/>
     <w:p>
       <w:pPr>
         <w:pStyle w:val="Heading2"/>
@@ -5184,7 +5505,7 @@
         <w:rPr>
           <w:rStyle w:val="VerbatimChar"/>
         </w:rPr>
-        <w:t xml:space="preserve">tenants  main@sha1:cca67164  True  Applied revision: main@sha1:cca67164</w:t>
+        <w:t xml:space="preserve">tenants  main@sha1:769a9c39  True  Applied revision: main@sha1:769a9c39</w:t>
       </w:r>
     </w:p>
     <w:p>
@@ -5227,7 +5548,7 @@
         <w:rPr>
           <w:rStyle w:val="VerbatimChar"/>
         </w:rPr>
-        <w:t xml:space="preserve">cca67164</w:t>
+        <w:t xml:space="preserve">769a9c39</w:t>
       </w:r>
       <w:r>
         <w:t xml:space="preserve"> </w:t>
@@ -5239,6 +5560,167 @@
     <w:p>
       <w:pPr>
         <w:pStyle w:val="BodyText"/>
+      </w:pPr>
+      <w:r>
+        <w:drawing>
+          <wp:inline>
+            <wp:extent cx="5943600" cy="1180615"/>
+            <wp:effectExtent b="0" l="0" r="0" t="0"/>
+            <wp:docPr descr="The 60% share rendered from the cluster's own ConfigMap: limits.cpu 24, requests.cpu 12" title="" id="43" name="Picture"/>
+            <a:graphic>
+              <a:graphicData uri="http://schemas.openxmlformats.org/drawingml/2006/picture">
+                <pic:pic>
+                  <pic:nvPicPr>
+                    <pic:cNvPr descr="../artifacts/lab-27/screenshots/08-budget-60-percent-share.png" id="44" name="Picture"/>
+                    <pic:cNvPicPr>
+                      <a:picLocks noChangeArrowheads="1" noChangeAspect="1"/>
+                    </pic:cNvPicPr>
+                  </pic:nvPicPr>
+                  <pic:blipFill>
+                    <a:blip r:embed="rId42"/>
+                    <a:stretch>
+                      <a:fillRect/>
+                    </a:stretch>
+                  </pic:blipFill>
+                  <pic:spPr bwMode="auto">
+                    <a:xfrm>
+                      <a:off x="0" y="0"/>
+                      <a:ext cx="5943600" cy="1180615"/>
+                    </a:xfrm>
+                    <a:prstGeom prst="rect">
+                      <a:avLst/>
+                    </a:prstGeom>
+                    <a:noFill/>
+                    <a:ln w="9525">
+                      <a:noFill/>
+                      <a:headEnd/>
+                      <a:tailEnd/>
+                    </a:ln>
+                  </pic:spPr>
+                </pic:pic>
+              </a:graphicData>
+            </a:graphic>
+          </wp:inline>
+        </w:drawing>
+      </w:r>
+    </w:p>
+    <w:p>
+      <w:pPr>
+        <w:pStyle w:val="BodyText"/>
+      </w:pPr>
+      <w:r>
+        <w:drawing>
+          <wp:inline>
+            <wp:extent cx="5943600" cy="1099566"/>
+            <wp:effectExtent b="0" l="0" r="0" t="0"/>
+            <wp:docPr descr="The 40% share, applied at the very same revision 769a9c39: limits.cpu 16, requests.cpu 8" title="" id="46" name="Picture"/>
+            <a:graphic>
+              <a:graphicData uri="http://schemas.openxmlformats.org/drawingml/2006/picture">
+                <pic:pic>
+                  <pic:nvPicPr>
+                    <pic:cNvPr descr="../artifacts/lab-27/screenshots/09-budget-40-percent-same-git-sha.png" id="47" name="Picture"/>
+                    <pic:cNvPicPr>
+                      <a:picLocks noChangeArrowheads="1" noChangeAspect="1"/>
+                    </pic:cNvPicPr>
+                  </pic:nvPicPr>
+                  <pic:blipFill>
+                    <a:blip r:embed="rId45"/>
+                    <a:stretch>
+                      <a:fillRect/>
+                    </a:stretch>
+                  </pic:blipFill>
+                  <pic:spPr bwMode="auto">
+                    <a:xfrm>
+                      <a:off x="0" y="0"/>
+                      <a:ext cx="5943600" cy="1099566"/>
+                    </a:xfrm>
+                    <a:prstGeom prst="rect">
+                      <a:avLst/>
+                    </a:prstGeom>
+                    <a:noFill/>
+                    <a:ln w="9525">
+                      <a:noFill/>
+                      <a:headEnd/>
+                      <a:tailEnd/>
+                    </a:ln>
+                  </pic:spPr>
+                </pic:pic>
+              </a:graphicData>
+            </a:graphic>
+          </wp:inline>
+        </w:drawing>
+      </w:r>
+    </w:p>
+    <w:p>
+      <w:pPr>
+        <w:pStyle w:val="BlockText"/>
+      </w:pPr>
+      <w:r>
+        <w:t xml:space="preserve">The two captures above were taken on the same cluster minutes apart. Compare the revision line in</w:t>
+      </w:r>
+      <w:r>
+        <w:t xml:space="preserve"> </w:t>
+      </w:r>
+      <w:r>
+        <w:t xml:space="preserve">each:</w:t>
+      </w:r>
+      <w:r>
+        <w:t xml:space="preserve"> </w:t>
+      </w:r>
+      <w:r>
+        <w:rPr>
+          <w:rStyle w:val="VerbatimChar"/>
+        </w:rPr>
+        <w:t xml:space="preserve">main@sha1:769a9c39</w:t>
+      </w:r>
+      <w:r>
+        <w:t xml:space="preserve"> </w:t>
+      </w:r>
+      <w:r>
+        <w:t xml:space="preserve">produced</w:t>
+      </w:r>
+      <w:r>
+        <w:t xml:space="preserve"> </w:t>
+      </w:r>
+      <w:r>
+        <w:rPr>
+          <w:b/>
+          <w:bCs/>
+        </w:rPr>
+        <w:t xml:space="preserve">12 CPU</w:t>
+      </w:r>
+      <w:r>
+        <w:t xml:space="preserve"> </w:t>
+      </w:r>
+      <w:r>
+        <w:t xml:space="preserve">with one ConfigMap and</w:t>
+      </w:r>
+      <w:r>
+        <w:t xml:space="preserve"> </w:t>
+      </w:r>
+      <w:r>
+        <w:rPr>
+          <w:b/>
+          <w:bCs/>
+        </w:rPr>
+        <w:t xml:space="preserve">8 CPU</w:t>
+      </w:r>
+      <w:r>
+        <w:t xml:space="preserve"> </w:t>
+      </w:r>
+      <w:r>
+        <w:t xml:space="preserve">with the other.</w:t>
+      </w:r>
+      <w:r>
+        <w:t xml:space="preserve"> </w:t>
+      </w:r>
+      <w:r>
+        <w:t xml:space="preserve">Nothing in Git changed between them.</w:t>
+      </w:r>
+    </w:p>
+    <w:p>
+      <w:pPr>
+        <w:pStyle w:val="FirstParagraph"/>
       </w:pPr>
       <w:r>
         <w:t xml:space="preserve">That is the practical answer to</w:t>
@@ -5280,8 +5762,8 @@
         </w:pict>
       </w:r>
     </w:p>
-    <w:bookmarkEnd w:id="21"/>
-    <w:bookmarkStart w:id="22" w:name="X4e2ce2ca6fb441885e63107a106b0ba7a8529e9"/>
+    <w:bookmarkEnd w:id="48"/>
+    <w:bookmarkStart w:id="49" w:name="X4e2ce2ca6fb441885e63107a106b0ba7a8529e9"/>
     <w:p>
       <w:pPr>
         <w:pStyle w:val="Heading2"/>
@@ -5511,8 +5993,8 @@
         </w:pict>
       </w:r>
     </w:p>
-    <w:bookmarkEnd w:id="22"/>
-    <w:bookmarkStart w:id="23" w:name="step-8--clean-up"/>
+    <w:bookmarkEnd w:id="49"/>
+    <w:bookmarkStart w:id="50" w:name="step-8--clean-up"/>
     <w:p>
       <w:pPr>
         <w:pStyle w:val="Heading2"/>
@@ -5557,8 +6039,8 @@
         </w:pict>
       </w:r>
     </w:p>
-    <w:bookmarkEnd w:id="23"/>
-    <w:bookmarkStart w:id="24" w:name="what-you-learned"/>
+    <w:bookmarkEnd w:id="50"/>
+    <w:bookmarkStart w:id="51" w:name="what-you-learned"/>
     <w:p>
       <w:pPr>
         <w:pStyle w:val="Heading2"/>
@@ -6050,14 +6532,14 @@
               <w:rPr>
                 <w:rStyle w:val="VerbatimChar"/>
               </w:rPr>
-              <w:t xml:space="preserve">cca67164</w:t>
+              <w:t xml:space="preserve">769a9c39</w:t>
             </w:r>
           </w:p>
         </w:tc>
       </w:tr>
     </w:tbl>
-    <w:bookmarkEnd w:id="24"/>
-    <w:bookmarkStart w:id="26" w:name="evidence"/>
+    <w:bookmarkEnd w:id="51"/>
+    <w:bookmarkStart w:id="54" w:name="evidence"/>
     <w:p>
       <w:pPr>
         <w:pStyle w:val="Heading2"/>
@@ -6076,7 +6558,7 @@
       <w:r>
         <w:t xml:space="preserve"> </w:t>
       </w:r>
-      <w:hyperlink r:id="rId25">
+      <w:hyperlink r:id="rId52">
         <w:r>
           <w:rPr>
             <w:rStyle w:val="VerbatimChar"/>
@@ -6093,38 +6575,164 @@
     </w:p>
     <w:p>
       <w:pPr>
+        <w:pStyle w:val="BodyText"/>
+      </w:pPr>
+      <w:r>
+        <w:t xml:space="preserve">Real terminal captures are in</w:t>
+      </w:r>
+      <w:r>
+        <w:t xml:space="preserve"> </w:t>
+      </w:r>
+      <w:hyperlink r:id="rId53">
+        <w:r>
+          <w:rPr>
+            <w:rStyle w:val="VerbatimChar"/>
+          </w:rPr>
+          <w:t xml:space="preserve">artifacts/lab-27/screenshots/</w:t>
+        </w:r>
+      </w:hyperlink>
+      <w:r>
+        <w:t xml:space="preserve"> </w:t>
+      </w:r>
+      <w:r>
+        <w:t xml:space="preserve">(9 images), taken during a live run on 2026-09-27 against a fresh</w:t>
+      </w:r>
+      <w:r>
+        <w:t xml:space="preserve"> </w:t>
+      </w:r>
+      <w:r>
+        <w:rPr>
+          <w:rStyle w:val="VerbatimChar"/>
+        </w:rPr>
+        <w:t xml:space="preserve">kind</w:t>
+      </w:r>
+      <w:r>
+        <w:t xml:space="preserve"> </w:t>
+      </w:r>
+      <w:r>
+        <w:t xml:space="preserve">cluster — Kubernetes</w:t>
+      </w:r>
+      <w:r>
+        <w:t xml:space="preserve"> </w:t>
+      </w:r>
+      <w:r>
+        <w:t xml:space="preserve">1.37.0, Flux 2.9.5, Gitea 1.22.</w:t>
+      </w:r>
+    </w:p>
+    <w:p>
+      <w:pPr>
         <w:pStyle w:val="BlockText"/>
       </w:pPr>
-      <w:r>
-        <w:t xml:space="preserve">📷</w:t>
-      </w:r>
-      <w:r>
-        <w:t xml:space="preserve"> </w:t>
-      </w:r>
       <w:r>
         <w:rPr>
           <w:b/>
           <w:bCs/>
         </w:rPr>
-        <w:t xml:space="preserve">Screenshots outstanding.</w:t>
-      </w:r>
-      <w:r>
-        <w:t xml:space="preserve"> </w:t>
-      </w:r>
-      <w:r>
-        <w:t xml:space="preserve">The terminal captures for this lab have not been taken yet. The</w:t>
-      </w:r>
-      <w:r>
-        <w:t xml:space="preserve"> </w:t>
-      </w:r>
-      <w:r>
-        <w:t xml:space="preserve">transcript above is the authoritative record until they are; every command and output in this lab</w:t>
-      </w:r>
-      <w:r>
-        <w:t xml:space="preserve"> </w:t>
-      </w:r>
-      <w:r>
-        <w:t xml:space="preserve">comes from it.</w:t>
+        <w:t xml:space="preserve">Note on the two transcripts.</w:t>
+      </w:r>
+      <w:r>
+        <w:t xml:space="preserve"> </w:t>
+      </w:r>
+      <w:r>
+        <w:t xml:space="preserve">The screenshots come from a</w:t>
+      </w:r>
+      <w:r>
+        <w:t xml:space="preserve"> </w:t>
+      </w:r>
+      <w:r>
+        <w:rPr>
+          <w:i/>
+          <w:iCs/>
+        </w:rPr>
+        <w:t xml:space="preserve">later</w:t>
+      </w:r>
+      <w:r>
+        <w:t xml:space="preserve"> </w:t>
+      </w:r>
+      <w:r>
+        <w:t xml:space="preserve">run than the</w:t>
+      </w:r>
+      <w:r>
+        <w:t xml:space="preserve"> </w:t>
+      </w:r>
+      <w:r>
+        <w:rPr>
+          <w:rStyle w:val="VerbatimChar"/>
+        </w:rPr>
+        <w:t xml:space="preserve">lab-27-tenant-quota-governance.txt</w:t>
+      </w:r>
+      <w:r>
+        <w:t xml:space="preserve"> </w:t>
+      </w:r>
+      <w:r>
+        <w:t xml:space="preserve">transcript, so the Git revision differs — the images show</w:t>
+      </w:r>
+      <w:r>
+        <w:t xml:space="preserve"> </w:t>
+      </w:r>
+      <w:r>
+        <w:rPr>
+          <w:rStyle w:val="VerbatimChar"/>
+        </w:rPr>
+        <w:t xml:space="preserve">769a9c39</w:t>
+      </w:r>
+      <w:r>
+        <w:t xml:space="preserve">, the 2026-09-25 transcript shows</w:t>
+      </w:r>
+      <w:r>
+        <w:t xml:space="preserve"> </w:t>
+      </w:r>
+      <w:r>
+        <w:rPr>
+          <w:rStyle w:val="VerbatimChar"/>
+        </w:rPr>
+        <w:t xml:space="preserve">e70e20a3</w:t>
+      </w:r>
+      <w:r>
+        <w:t xml:space="preserve"> </w:t>
+      </w:r>
+      <w:r>
+        <w:t xml:space="preserve">/</w:t>
+      </w:r>
+      <w:r>
+        <w:t xml:space="preserve"> </w:t>
+      </w:r>
+      <w:r>
+        <w:rPr>
+          <w:rStyle w:val="VerbatimChar"/>
+        </w:rPr>
+        <w:t xml:space="preserve">cca67164</w:t>
+      </w:r>
+      <w:r>
+        <w:t xml:space="preserve">. Every command, value and</w:t>
+      </w:r>
+      <w:r>
+        <w:t xml:space="preserve"> </w:t>
+      </w:r>
+      <w:r>
+        <w:t xml:space="preserve">error message is otherwise identical, including the stop at</w:t>
+      </w:r>
+      <w:r>
+        <w:t xml:space="preserve"> </w:t>
+      </w:r>
+      <w:r>
+        <w:rPr>
+          <w:b/>
+          <w:bCs/>
+        </w:rPr>
+        <w:t xml:space="preserve">8/25</w:t>
+      </w:r>
+      <w:r>
+        <w:t xml:space="preserve"> </w:t>
+      </w:r>
+      <w:r>
+        <w:t xml:space="preserve">replicas. The lab body quotes</w:t>
+      </w:r>
+      <w:r>
+        <w:t xml:space="preserve"> </w:t>
+      </w:r>
+      <w:r>
+        <w:t xml:space="preserve">the revisions visible in the screenshots.</w:t>
       </w:r>
     </w:p>
     <w:p>
@@ -6163,7 +6771,7 @@
         <w:t xml:space="preserve">— the other half of Module 11, where a tenant that has hit the quota you just built borrows idle capacity from a cohort.</w:t>
       </w:r>
     </w:p>
-    <w:bookmarkEnd w:id="26"/>
+    <w:bookmarkEnd w:id="54"/>
     <w:sectPr>
       <w:pgSz w:h="15840" w:w="12240"/>
       <w:pgMar w:bottom="1440" w:footer="720" w:gutter="0" w:header="720" w:left="1440" w:right="1440" w:top="1440"/>

</xml_diff>